<commit_message>
Refresh DMS branding and documentation
</commit_message>
<xml_diff>
--- a/Dynamic Vegetation Management - Documentation.docx
+++ b/Dynamic Vegetation Management - Documentation.docx
@@ -28,7 +28,33 @@
           <w:lang w:eastAsia="en-IN"/>
           <w14:ligatures w14:val="none"/>
         </w:rPr>
-        <w:t>Dynamic Vegetation Management (DVM)</w:t>
+        <w:t>Dynamic Vegetation Management</w:t>
+      </w:r>
+      <w:r>
+        <w:rPr>
+          <w:rFonts w:ascii="Times New Roman" w:eastAsia="Times New Roman" w:hAnsi="Times New Roman" w:cs="Times New Roman"/>
+          <w:b/>
+          <w:bCs/>
+          <w:kern w:val="36"/>
+          <w:sz w:val="48"/>
+          <w:szCs w:val="48"/>
+          <w:lang w:eastAsia="en-IN"/>
+          <w14:ligatures w14:val="none"/>
+        </w:rPr>
+        <w:t xml:space="preserve"> Systems</w:t>
+      </w:r>
+      <w:r>
+        <w:rPr>
+          <w:rFonts w:ascii="Times New Roman" w:eastAsia="Times New Roman" w:hAnsi="Times New Roman" w:cs="Times New Roman"/>
+          <w:b/>
+          <w:bCs/>
+          <w:kern w:val="36"/>
+          <w:sz w:val="48"/>
+          <w:szCs w:val="48"/>
+          <w:lang w:eastAsia="en-IN"/>
+          <w14:ligatures w14:val="none"/>
+        </w:rPr>
+        <w:t xml:space="preserve"> (DVM)</w:t>
       </w:r>
     </w:p>
     <w:p>
@@ -43,7 +69,6 @@
           <w:lang w:eastAsia="en-IN"/>
         </w:rPr>
       </w:pPr>
-      <w:proofErr w:type="spellStart"/>
       <w:r>
         <w:rPr>
           <w:rFonts w:ascii="Times New Roman" w:hAnsi="Times New Roman" w:cs="Times New Roman"/>
@@ -53,9 +78,8 @@
           <w:szCs w:val="32"/>
           <w:lang w:eastAsia="en-IN"/>
         </w:rPr>
-        <w:t>OraKolars</w:t>
-      </w:r>
-      <w:proofErr w:type="spellEnd"/>
+        <w:t>Khoushick S</w:t>
+      </w:r>
     </w:p>
     <w:p>
       <w:pPr>
@@ -613,15 +637,7 @@
         <w:t>data-driven, predictive, and automated framework</w:t>
       </w:r>
       <w:r>
-        <w:t xml:space="preserve"> that ensures vegetation threats are detected, </w:t>
-      </w:r>
-      <w:proofErr w:type="spellStart"/>
-      <w:r>
-        <w:t>analyzed</w:t>
-      </w:r>
-      <w:proofErr w:type="spellEnd"/>
-      <w:r>
-        <w:t>, and acted upon well before they become critical.</w:t>
+        <w:t xml:space="preserve"> that ensures vegetation threats are detected, analyzed, and acted upon well before they become critical.</w:t>
       </w:r>
     </w:p>
     <w:p>
@@ -691,15 +707,7 @@
         </w:numPr>
       </w:pPr>
       <w:r>
-        <w:t xml:space="preserve">LiDAR generates high-density 3D point clouds for spatial geometry, while RGB images capture texture and </w:t>
-      </w:r>
-      <w:proofErr w:type="spellStart"/>
-      <w:r>
-        <w:t>color</w:t>
-      </w:r>
-      <w:proofErr w:type="spellEnd"/>
-      <w:r>
-        <w:t xml:space="preserve"> for species classification.</w:t>
+        <w:t>LiDAR generates high-density 3D point clouds for spatial geometry, while RGB images capture texture and color for species classification.</w:t>
       </w:r>
     </w:p>
     <w:p>
@@ -726,7 +734,6 @@
         <w:rPr>
           <w:rStyle w:val="Strong"/>
         </w:rPr>
-        <w:lastRenderedPageBreak/>
         <w:t>Data Fusion &amp; Preprocessing</w:t>
       </w:r>
     </w:p>
@@ -913,16 +920,8 @@
         <w:rPr>
           <w:rStyle w:val="Strong"/>
         </w:rPr>
-        <w:t xml:space="preserve">Predictive Growth </w:t>
-      </w:r>
-      <w:proofErr w:type="spellStart"/>
-      <w:r>
-        <w:rPr>
-          <w:rStyle w:val="Strong"/>
-        </w:rPr>
-        <w:t>Modeling</w:t>
-      </w:r>
-      <w:proofErr w:type="spellEnd"/>
+        <w:t>Predictive Growth Modeling</w:t>
+      </w:r>
     </w:p>
     <w:p>
       <w:pPr>
@@ -1151,7 +1150,7 @@
           <w:noProof/>
         </w:rPr>
         <w:drawing>
-          <wp:anchor distT="0" distB="0" distL="114300" distR="114300" simplePos="0" relativeHeight="251661312" behindDoc="0" locked="0" layoutInCell="1" allowOverlap="1" wp14:anchorId="09DB8537" wp14:editId="55B6AC09">
+          <wp:anchor distT="0" distB="0" distL="114300" distR="114300" simplePos="0" relativeHeight="251661312" behindDoc="0" locked="0" layoutInCell="1" allowOverlap="1" wp14:anchorId="09DB8537" wp14:editId="5F77F7B6">
             <wp:simplePos x="0" y="0"/>
             <wp:positionH relativeFrom="margin">
               <wp:posOffset>2160905</wp:posOffset>
@@ -1225,7 +1224,7 @@
           <w:noProof/>
         </w:rPr>
         <w:drawing>
-          <wp:anchor distT="0" distB="0" distL="114300" distR="114300" simplePos="0" relativeHeight="251662336" behindDoc="0" locked="0" layoutInCell="1" allowOverlap="1" wp14:anchorId="1A454F10" wp14:editId="182B71BA">
+          <wp:anchor distT="0" distB="0" distL="114300" distR="114300" simplePos="0" relativeHeight="251662336" behindDoc="0" locked="0" layoutInCell="1" allowOverlap="1" wp14:anchorId="1A454F10" wp14:editId="25B9AEE9">
             <wp:simplePos x="0" y="0"/>
             <wp:positionH relativeFrom="margin">
               <wp:posOffset>5715000</wp:posOffset>
@@ -1651,6 +1650,7 @@
         </w:numPr>
       </w:pPr>
       <w:r>
+        <w:lastRenderedPageBreak/>
         <w:t xml:space="preserve">Auto-generate </w:t>
       </w:r>
       <w:r>
@@ -1817,7 +1817,6 @@
           <w:lang w:eastAsia="en-IN"/>
           <w14:ligatures w14:val="none"/>
         </w:rPr>
-        <w:lastRenderedPageBreak/>
         <w:t>AI Enhancements</w:t>
       </w:r>
     </w:p>
@@ -1889,23 +1888,8 @@
           <w:lang w:eastAsia="en-IN"/>
           <w14:ligatures w14:val="none"/>
         </w:rPr>
-        <w:t xml:space="preserve">Predictive Growth </w:t>
-      </w:r>
-      <w:proofErr w:type="spellStart"/>
-      <w:r>
-        <w:rPr>
-          <w:rFonts w:ascii="Times New Roman" w:eastAsia="Times New Roman" w:hAnsi="Times New Roman" w:cs="Times New Roman"/>
-          <w:b/>
-          <w:bCs/>
-          <w:kern w:val="0"/>
-          <w:sz w:val="24"/>
-          <w:szCs w:val="24"/>
-          <w:lang w:eastAsia="en-IN"/>
-          <w14:ligatures w14:val="none"/>
-        </w:rPr>
-        <w:t>Modeling</w:t>
-      </w:r>
-      <w:proofErr w:type="spellEnd"/>
+        <w:t>Predictive Growth Modeling</w:t>
+      </w:r>
       <w:r>
         <w:rPr>
           <w:rFonts w:ascii="Times New Roman" w:eastAsia="Times New Roman" w:hAnsi="Times New Roman" w:cs="Times New Roman"/>
@@ -2560,7 +2544,6 @@
         </w:rPr>
         <w:t xml:space="preserve">Creates </w:t>
       </w:r>
-      <w:proofErr w:type="gramStart"/>
       <w:r>
         <w:rPr>
           <w:rFonts w:ascii="Times New Roman" w:eastAsia="Times New Roman" w:hAnsi="Times New Roman" w:cs="Times New Roman"/>
@@ -2572,21 +2555,7 @@
           <w:lang w:eastAsia="en-IN"/>
           <w14:ligatures w14:val="none"/>
         </w:rPr>
-        <w:t>Non-Outage</w:t>
-      </w:r>
-      <w:proofErr w:type="gramEnd"/>
-      <w:r>
-        <w:rPr>
-          <w:rFonts w:ascii="Times New Roman" w:eastAsia="Times New Roman" w:hAnsi="Times New Roman" w:cs="Times New Roman"/>
-          <w:b/>
-          <w:bCs/>
-          <w:kern w:val="0"/>
-          <w:sz w:val="24"/>
-          <w:szCs w:val="24"/>
-          <w:lang w:eastAsia="en-IN"/>
-          <w14:ligatures w14:val="none"/>
-        </w:rPr>
-        <w:t xml:space="preserve"> events</w:t>
+        <w:t>Non-Outage events</w:t>
       </w:r>
       <w:r>
         <w:rPr>
@@ -3035,23 +3004,8 @@
           <w:lang w:eastAsia="en-IN"/>
           <w14:ligatures w14:val="none"/>
         </w:rPr>
-        <w:t xml:space="preserve">TensorFlow / </w:t>
-      </w:r>
-      <w:proofErr w:type="spellStart"/>
-      <w:r>
-        <w:rPr>
-          <w:rFonts w:ascii="Times New Roman" w:eastAsia="Times New Roman" w:hAnsi="Times New Roman" w:cs="Times New Roman"/>
-          <w:b/>
-          <w:bCs/>
-          <w:kern w:val="0"/>
-          <w:sz w:val="24"/>
-          <w:szCs w:val="24"/>
-          <w:lang w:eastAsia="en-IN"/>
-          <w14:ligatures w14:val="none"/>
-        </w:rPr>
-        <w:t>PyTorch</w:t>
-      </w:r>
-      <w:proofErr w:type="spellEnd"/>
+        <w:t>TensorFlow / PyTorch</w:t>
+      </w:r>
       <w:r>
         <w:rPr>
           <w:rFonts w:ascii="Times New Roman" w:eastAsia="Times New Roman" w:hAnsi="Times New Roman" w:cs="Times New Roman"/>
@@ -3091,6 +3045,7 @@
           <w:lang w:eastAsia="en-IN"/>
           <w14:ligatures w14:val="none"/>
         </w:rPr>
+        <w:lastRenderedPageBreak/>
         <w:t>OpenCV</w:t>
       </w:r>
       <w:r>
@@ -3429,7 +3384,6 @@
         <w:pStyle w:val="Heading2"/>
       </w:pPr>
       <w:r>
-        <w:lastRenderedPageBreak/>
         <w:t>Business Value</w:t>
       </w:r>
     </w:p>
@@ -3573,7 +3527,12 @@
       </w:pPr>
     </w:p>
     <w:sectPr>
-      <w:footerReference w:type="default" r:id="rId11"/>
+      <w:headerReference w:type="even" r:id="rId11"/>
+      <w:headerReference w:type="default" r:id="rId12"/>
+      <w:footerReference w:type="even" r:id="rId13"/>
+      <w:footerReference w:type="default" r:id="rId14"/>
+      <w:headerReference w:type="first" r:id="rId15"/>
+      <w:footerReference w:type="first" r:id="rId16"/>
       <w:pgSz w:w="11906" w:h="16838"/>
       <w:pgMar w:top="284" w:right="424" w:bottom="284" w:left="426" w:header="708" w:footer="708" w:gutter="0"/>
       <w:cols w:space="708"/>
@@ -3609,6 +3568,16 @@
 </file>
 
 <file path=word/footer1.xml><?xml version="1.0" encoding="utf-8"?>
+<w:ftr xmlns:wpc="http://schemas.microsoft.com/office/word/2010/wordprocessingCanvas" xmlns:cx="http://schemas.microsoft.com/office/drawing/2014/chartex" xmlns:cx1="http://schemas.microsoft.com/office/drawing/2015/9/8/chartex" xmlns:cx2="http://schemas.microsoft.com/office/drawing/2015/10/21/chartex" xmlns:cx3="http://schemas.microsoft.com/office/drawing/2016/5/9/chartex" xmlns:cx4="http://schemas.microsoft.com/office/drawing/2016/5/10/chartex" xmlns:cx5="http://schemas.microsoft.com/office/drawing/2016/5/11/chartex" xmlns:cx6="http://schemas.microsoft.com/office/drawing/2016/5/12/chartex" xmlns:cx7="http://schemas.microsoft.com/office/drawing/2016/5/13/chartex" xmlns:cx8="http://schemas.microsoft.com/office/drawing/2016/5/14/chartex" xmlns:mc="http://schemas.openxmlformats.org/markup-compatibility/2006" xmlns:aink="http://schemas.microsoft.com/office/drawing/2016/ink" xmlns:am3d="http://schemas.microsoft.com/office/drawing/2017/model3d" xmlns:o="urn:schemas-microsoft-com:office:office" xmlns:oel="http://schemas.microsoft.com/office/2019/extlst" xmlns:r="http://schemas.openxmlformats.org/officeDocument/2006/relationships" xmlns:m="http://schemas.openxmlformats.org/officeDocument/2006/math" xmlns:v="urn:schemas-microsoft-com:vml" xmlns:wp14="http://schemas.microsoft.com/office/word/2010/wordprocessingDrawing" xmlns:wp="http://schemas.openxmlformats.org/drawingml/2006/wordprocessingDrawing" xmlns:w10="urn:schemas-microsoft-com:office:word" xmlns:w="http://schemas.openxmlformats.org/wordprocessingml/2006/main" xmlns:w14="http://schemas.microsoft.com/office/word/2010/wordml" xmlns:w15="http://schemas.microsoft.com/office/word/2012/wordml" xmlns:w16cex="http://schemas.microsoft.com/office/word/2018/wordml/cex" xmlns:w16cid="http://schemas.microsoft.com/office/word/2016/wordml/cid" xmlns:w16="http://schemas.microsoft.com/office/word/2018/wordml" xmlns:w16du="http://schemas.microsoft.com/office/word/2023/wordml/word16du" xmlns:w16sdtdh="http://schemas.microsoft.com/office/word/2020/wordml/sdtdatahash" xmlns:w16sdtfl="http://schemas.microsoft.com/office/word/2024/wordml/sdtformatlock" xmlns:w16se="http://schemas.microsoft.com/office/word/2015/wordml/symex" xmlns:wpg="http://schemas.microsoft.com/office/word/2010/wordprocessingGroup" xmlns:wpi="http://schemas.microsoft.com/office/word/2010/wordprocessingInk" xmlns:wne="http://schemas.microsoft.com/office/word/2006/wordml" xmlns:wps="http://schemas.microsoft.com/office/word/2010/wordprocessingShape" mc:Ignorable="w14 w15 w16se w16cid w16 w16cex w16sdtdh w16sdtfl w16du wp14">
+  <w:p>
+    <w:pPr>
+      <w:pStyle w:val="Footer"/>
+    </w:pPr>
+  </w:p>
+</w:ftr>
+</file>
+
+<file path=word/footer2.xml><?xml version="1.0" encoding="utf-8"?>
 <w:ftr xmlns:wpc="http://schemas.microsoft.com/office/word/2010/wordprocessingCanvas" xmlns:cx="http://schemas.microsoft.com/office/drawing/2014/chartex" xmlns:cx1="http://schemas.microsoft.com/office/drawing/2015/9/8/chartex" xmlns:cx2="http://schemas.microsoft.com/office/drawing/2015/10/21/chartex" xmlns:cx3="http://schemas.microsoft.com/office/drawing/2016/5/9/chartex" xmlns:cx4="http://schemas.microsoft.com/office/drawing/2016/5/10/chartex" xmlns:cx5="http://schemas.microsoft.com/office/drawing/2016/5/11/chartex" xmlns:cx6="http://schemas.microsoft.com/office/drawing/2016/5/12/chartex" xmlns:cx7="http://schemas.microsoft.com/office/drawing/2016/5/13/chartex" xmlns:cx8="http://schemas.microsoft.com/office/drawing/2016/5/14/chartex" xmlns:mc="http://schemas.openxmlformats.org/markup-compatibility/2006" xmlns:aink="http://schemas.microsoft.com/office/drawing/2016/ink" xmlns:am3d="http://schemas.microsoft.com/office/drawing/2017/model3d" xmlns:o="urn:schemas-microsoft-com:office:office" xmlns:oel="http://schemas.microsoft.com/office/2019/extlst" xmlns:r="http://schemas.openxmlformats.org/officeDocument/2006/relationships" xmlns:m="http://schemas.openxmlformats.org/officeDocument/2006/math" xmlns:v="urn:schemas-microsoft-com:vml" xmlns:wp14="http://schemas.microsoft.com/office/word/2010/wordprocessingDrawing" xmlns:wp="http://schemas.openxmlformats.org/drawingml/2006/wordprocessingDrawing" xmlns:w10="urn:schemas-microsoft-com:office:word" xmlns:w="http://schemas.openxmlformats.org/wordprocessingml/2006/main" xmlns:w14="http://schemas.microsoft.com/office/word/2010/wordml" xmlns:w15="http://schemas.microsoft.com/office/word/2012/wordml" xmlns:w16cex="http://schemas.microsoft.com/office/word/2018/wordml/cex" xmlns:w16cid="http://schemas.microsoft.com/office/word/2016/wordml/cid" xmlns:w16="http://schemas.microsoft.com/office/word/2018/wordml" xmlns:w16du="http://schemas.microsoft.com/office/word/2023/wordml/word16du" xmlns:w16sdtdh="http://schemas.microsoft.com/office/word/2020/wordml/sdtdatahash" xmlns:w16sdtfl="http://schemas.microsoft.com/office/word/2024/wordml/sdtformatlock" xmlns:w16se="http://schemas.microsoft.com/office/word/2015/wordml/symex" xmlns:wpg="http://schemas.microsoft.com/office/word/2010/wordprocessingGroup" xmlns:wpi="http://schemas.microsoft.com/office/word/2010/wordprocessingInk" xmlns:wne="http://schemas.microsoft.com/office/word/2006/wordml" xmlns:wps="http://schemas.microsoft.com/office/word/2010/wordprocessingShape" mc:Ignorable="w14 w15 w16se w16cid w16 w16cex w16sdtdh w16sdtfl w16du wp14">
   <w:p>
     <w:pPr>
@@ -3746,16 +3715,14 @@
                                 <w:text/>
                               </w:sdtPr>
                               <w:sdtContent>
-                                <w:proofErr w:type="spellStart"/>
                                 <w:r>
                                   <w:rPr>
                                     <w:color w:val="808080" w:themeColor="background1" w:themeShade="80"/>
                                     <w:sz w:val="20"/>
                                     <w:szCs w:val="20"/>
                                   </w:rPr>
-                                  <w:t>OraKolars</w:t>
+                                  <w:t>KHOUSHICK S</w:t>
                                 </w:r>
-                                <w:proofErr w:type="spellEnd"/>
                               </w:sdtContent>
                             </w:sdt>
                             <w:r>
@@ -3790,6 +3757,15 @@
                                     <w:szCs w:val="20"/>
                                   </w:rPr>
                                   <w:t>Dynamic Vegetation management</w:t>
+                                </w:r>
+                                <w:r>
+                                  <w:rPr>
+                                    <w:caps/>
+                                    <w:color w:val="808080" w:themeColor="background1" w:themeShade="80"/>
+                                    <w:sz w:val="20"/>
+                                    <w:szCs w:val="20"/>
+                                  </w:rPr>
+                                  <w:t xml:space="preserve"> SYSTEMS</w:t>
                                 </w:r>
                               </w:sdtContent>
                             </w:sdt>
@@ -3846,16 +3822,14 @@
                           <w:text/>
                         </w:sdtPr>
                         <w:sdtContent>
-                          <w:proofErr w:type="spellStart"/>
                           <w:r>
                             <w:rPr>
                               <w:color w:val="808080" w:themeColor="background1" w:themeShade="80"/>
                               <w:sz w:val="20"/>
                               <w:szCs w:val="20"/>
                             </w:rPr>
-                            <w:t>OraKolars</w:t>
+                            <w:t>KHOUSHICK S</w:t>
                           </w:r>
-                          <w:proofErr w:type="spellEnd"/>
                         </w:sdtContent>
                       </w:sdt>
                       <w:r>
@@ -3891,6 +3865,15 @@
                             </w:rPr>
                             <w:t>Dynamic Vegetation management</w:t>
                           </w:r>
+                          <w:r>
+                            <w:rPr>
+                              <w:caps/>
+                              <w:color w:val="808080" w:themeColor="background1" w:themeShade="80"/>
+                              <w:sz w:val="20"/>
+                              <w:szCs w:val="20"/>
+                            </w:rPr>
+                            <w:t xml:space="preserve"> SYSTEMS</w:t>
+                          </w:r>
                         </w:sdtContent>
                       </w:sdt>
                     </w:p>
@@ -3907,6 +3890,16 @@
 </w:ftr>
 </file>
 
+<file path=word/footer3.xml><?xml version="1.0" encoding="utf-8"?>
+<w:ftr xmlns:wpc="http://schemas.microsoft.com/office/word/2010/wordprocessingCanvas" xmlns:cx="http://schemas.microsoft.com/office/drawing/2014/chartex" xmlns:cx1="http://schemas.microsoft.com/office/drawing/2015/9/8/chartex" xmlns:cx2="http://schemas.microsoft.com/office/drawing/2015/10/21/chartex" xmlns:cx3="http://schemas.microsoft.com/office/drawing/2016/5/9/chartex" xmlns:cx4="http://schemas.microsoft.com/office/drawing/2016/5/10/chartex" xmlns:cx5="http://schemas.microsoft.com/office/drawing/2016/5/11/chartex" xmlns:cx6="http://schemas.microsoft.com/office/drawing/2016/5/12/chartex" xmlns:cx7="http://schemas.microsoft.com/office/drawing/2016/5/13/chartex" xmlns:cx8="http://schemas.microsoft.com/office/drawing/2016/5/14/chartex" xmlns:mc="http://schemas.openxmlformats.org/markup-compatibility/2006" xmlns:aink="http://schemas.microsoft.com/office/drawing/2016/ink" xmlns:am3d="http://schemas.microsoft.com/office/drawing/2017/model3d" xmlns:o="urn:schemas-microsoft-com:office:office" xmlns:oel="http://schemas.microsoft.com/office/2019/extlst" xmlns:r="http://schemas.openxmlformats.org/officeDocument/2006/relationships" xmlns:m="http://schemas.openxmlformats.org/officeDocument/2006/math" xmlns:v="urn:schemas-microsoft-com:vml" xmlns:wp14="http://schemas.microsoft.com/office/word/2010/wordprocessingDrawing" xmlns:wp="http://schemas.openxmlformats.org/drawingml/2006/wordprocessingDrawing" xmlns:w10="urn:schemas-microsoft-com:office:word" xmlns:w="http://schemas.openxmlformats.org/wordprocessingml/2006/main" xmlns:w14="http://schemas.microsoft.com/office/word/2010/wordml" xmlns:w15="http://schemas.microsoft.com/office/word/2012/wordml" xmlns:w16cex="http://schemas.microsoft.com/office/word/2018/wordml/cex" xmlns:w16cid="http://schemas.microsoft.com/office/word/2016/wordml/cid" xmlns:w16="http://schemas.microsoft.com/office/word/2018/wordml" xmlns:w16du="http://schemas.microsoft.com/office/word/2023/wordml/word16du" xmlns:w16sdtdh="http://schemas.microsoft.com/office/word/2020/wordml/sdtdatahash" xmlns:w16sdtfl="http://schemas.microsoft.com/office/word/2024/wordml/sdtformatlock" xmlns:w16se="http://schemas.microsoft.com/office/word/2015/wordml/symex" xmlns:wpg="http://schemas.microsoft.com/office/word/2010/wordprocessingGroup" xmlns:wpi="http://schemas.microsoft.com/office/word/2010/wordprocessingInk" xmlns:wne="http://schemas.microsoft.com/office/word/2006/wordml" xmlns:wps="http://schemas.microsoft.com/office/word/2010/wordprocessingShape" mc:Ignorable="w14 w15 w16se w16cid w16 w16cex w16sdtdh w16sdtfl w16du wp14">
+  <w:p>
+    <w:pPr>
+      <w:pStyle w:val="Footer"/>
+    </w:pPr>
+  </w:p>
+</w:ftr>
+</file>
+
 <file path=word/footnotes.xml><?xml version="1.0" encoding="utf-8"?>
 <w:footnotes xmlns:wpc="http://schemas.microsoft.com/office/word/2010/wordprocessingCanvas" xmlns:cx="http://schemas.microsoft.com/office/drawing/2014/chartex" xmlns:cx1="http://schemas.microsoft.com/office/drawing/2015/9/8/chartex" xmlns:cx2="http://schemas.microsoft.com/office/drawing/2015/10/21/chartex" xmlns:cx3="http://schemas.microsoft.com/office/drawing/2016/5/9/chartex" xmlns:cx4="http://schemas.microsoft.com/office/drawing/2016/5/10/chartex" xmlns:cx5="http://schemas.microsoft.com/office/drawing/2016/5/11/chartex" xmlns:cx6="http://schemas.microsoft.com/office/drawing/2016/5/12/chartex" xmlns:cx7="http://schemas.microsoft.com/office/drawing/2016/5/13/chartex" xmlns:cx8="http://schemas.microsoft.com/office/drawing/2016/5/14/chartex" xmlns:mc="http://schemas.openxmlformats.org/markup-compatibility/2006" xmlns:aink="http://schemas.microsoft.com/office/drawing/2016/ink" xmlns:am3d="http://schemas.microsoft.com/office/drawing/2017/model3d" xmlns:o="urn:schemas-microsoft-com:office:office" xmlns:oel="http://schemas.microsoft.com/office/2019/extlst" xmlns:r="http://schemas.openxmlformats.org/officeDocument/2006/relationships" xmlns:m="http://schemas.openxmlformats.org/officeDocument/2006/math" xmlns:v="urn:schemas-microsoft-com:vml" xmlns:wp14="http://schemas.microsoft.com/office/word/2010/wordprocessingDrawing" xmlns:wp="http://schemas.openxmlformats.org/drawingml/2006/wordprocessingDrawing" xmlns:w10="urn:schemas-microsoft-com:office:word" xmlns:w="http://schemas.openxmlformats.org/wordprocessingml/2006/main" xmlns:w14="http://schemas.microsoft.com/office/word/2010/wordml" xmlns:w15="http://schemas.microsoft.com/office/word/2012/wordml" xmlns:w16cex="http://schemas.microsoft.com/office/word/2018/wordml/cex" xmlns:w16cid="http://schemas.microsoft.com/office/word/2016/wordml/cid" xmlns:w16="http://schemas.microsoft.com/office/word/2018/wordml" xmlns:w16du="http://schemas.microsoft.com/office/word/2023/wordml/word16du" xmlns:w16sdtdh="http://schemas.microsoft.com/office/word/2020/wordml/sdtdatahash" xmlns:w16sdtfl="http://schemas.microsoft.com/office/word/2024/wordml/sdtformatlock" xmlns:w16se="http://schemas.microsoft.com/office/word/2015/wordml/symex" xmlns:wpg="http://schemas.microsoft.com/office/word/2010/wordprocessingGroup" xmlns:wpi="http://schemas.microsoft.com/office/word/2010/wordprocessingInk" xmlns:wne="http://schemas.microsoft.com/office/word/2006/wordml" xmlns:wps="http://schemas.microsoft.com/office/word/2010/wordprocessingShape" mc:Ignorable="w14 w15 w16se w16cid w16 w16cex w16sdtdh w16sdtfl w16du wp14">
   <w:footnote w:type="separator" w:id="-1">
@@ -3930,6 +3923,36 @@
     </w:p>
   </w:footnote>
 </w:footnotes>
+</file>
+
+<file path=word/header1.xml><?xml version="1.0" encoding="utf-8"?>
+<w:hdr xmlns:wpc="http://schemas.microsoft.com/office/word/2010/wordprocessingCanvas" xmlns:cx="http://schemas.microsoft.com/office/drawing/2014/chartex" xmlns:cx1="http://schemas.microsoft.com/office/drawing/2015/9/8/chartex" xmlns:cx2="http://schemas.microsoft.com/office/drawing/2015/10/21/chartex" xmlns:cx3="http://schemas.microsoft.com/office/drawing/2016/5/9/chartex" xmlns:cx4="http://schemas.microsoft.com/office/drawing/2016/5/10/chartex" xmlns:cx5="http://schemas.microsoft.com/office/drawing/2016/5/11/chartex" xmlns:cx6="http://schemas.microsoft.com/office/drawing/2016/5/12/chartex" xmlns:cx7="http://schemas.microsoft.com/office/drawing/2016/5/13/chartex" xmlns:cx8="http://schemas.microsoft.com/office/drawing/2016/5/14/chartex" xmlns:mc="http://schemas.openxmlformats.org/markup-compatibility/2006" xmlns:aink="http://schemas.microsoft.com/office/drawing/2016/ink" xmlns:am3d="http://schemas.microsoft.com/office/drawing/2017/model3d" xmlns:o="urn:schemas-microsoft-com:office:office" xmlns:oel="http://schemas.microsoft.com/office/2019/extlst" xmlns:r="http://schemas.openxmlformats.org/officeDocument/2006/relationships" xmlns:m="http://schemas.openxmlformats.org/officeDocument/2006/math" xmlns:v="urn:schemas-microsoft-com:vml" xmlns:wp14="http://schemas.microsoft.com/office/word/2010/wordprocessingDrawing" xmlns:wp="http://schemas.openxmlformats.org/drawingml/2006/wordprocessingDrawing" xmlns:w10="urn:schemas-microsoft-com:office:word" xmlns:w="http://schemas.openxmlformats.org/wordprocessingml/2006/main" xmlns:w14="http://schemas.microsoft.com/office/word/2010/wordml" xmlns:w15="http://schemas.microsoft.com/office/word/2012/wordml" xmlns:w16cex="http://schemas.microsoft.com/office/word/2018/wordml/cex" xmlns:w16cid="http://schemas.microsoft.com/office/word/2016/wordml/cid" xmlns:w16="http://schemas.microsoft.com/office/word/2018/wordml" xmlns:w16du="http://schemas.microsoft.com/office/word/2023/wordml/word16du" xmlns:w16sdtdh="http://schemas.microsoft.com/office/word/2020/wordml/sdtdatahash" xmlns:w16sdtfl="http://schemas.microsoft.com/office/word/2024/wordml/sdtformatlock" xmlns:w16se="http://schemas.microsoft.com/office/word/2015/wordml/symex" xmlns:wpg="http://schemas.microsoft.com/office/word/2010/wordprocessingGroup" xmlns:wpi="http://schemas.microsoft.com/office/word/2010/wordprocessingInk" xmlns:wne="http://schemas.microsoft.com/office/word/2006/wordml" xmlns:wps="http://schemas.microsoft.com/office/word/2010/wordprocessingShape" mc:Ignorable="w14 w15 w16se w16cid w16 w16cex w16sdtdh w16sdtfl w16du wp14">
+  <w:p>
+    <w:pPr>
+      <w:pStyle w:val="Header"/>
+    </w:pPr>
+  </w:p>
+</w:hdr>
+</file>
+
+<file path=word/header2.xml><?xml version="1.0" encoding="utf-8"?>
+<w:hdr xmlns:wpc="http://schemas.microsoft.com/office/word/2010/wordprocessingCanvas" xmlns:cx="http://schemas.microsoft.com/office/drawing/2014/chartex" xmlns:cx1="http://schemas.microsoft.com/office/drawing/2015/9/8/chartex" xmlns:cx2="http://schemas.microsoft.com/office/drawing/2015/10/21/chartex" xmlns:cx3="http://schemas.microsoft.com/office/drawing/2016/5/9/chartex" xmlns:cx4="http://schemas.microsoft.com/office/drawing/2016/5/10/chartex" xmlns:cx5="http://schemas.microsoft.com/office/drawing/2016/5/11/chartex" xmlns:cx6="http://schemas.microsoft.com/office/drawing/2016/5/12/chartex" xmlns:cx7="http://schemas.microsoft.com/office/drawing/2016/5/13/chartex" xmlns:cx8="http://schemas.microsoft.com/office/drawing/2016/5/14/chartex" xmlns:mc="http://schemas.openxmlformats.org/markup-compatibility/2006" xmlns:aink="http://schemas.microsoft.com/office/drawing/2016/ink" xmlns:am3d="http://schemas.microsoft.com/office/drawing/2017/model3d" xmlns:o="urn:schemas-microsoft-com:office:office" xmlns:oel="http://schemas.microsoft.com/office/2019/extlst" xmlns:r="http://schemas.openxmlformats.org/officeDocument/2006/relationships" xmlns:m="http://schemas.openxmlformats.org/officeDocument/2006/math" xmlns:v="urn:schemas-microsoft-com:vml" xmlns:wp14="http://schemas.microsoft.com/office/word/2010/wordprocessingDrawing" xmlns:wp="http://schemas.openxmlformats.org/drawingml/2006/wordprocessingDrawing" xmlns:w10="urn:schemas-microsoft-com:office:word" xmlns:w="http://schemas.openxmlformats.org/wordprocessingml/2006/main" xmlns:w14="http://schemas.microsoft.com/office/word/2010/wordml" xmlns:w15="http://schemas.microsoft.com/office/word/2012/wordml" xmlns:w16cex="http://schemas.microsoft.com/office/word/2018/wordml/cex" xmlns:w16cid="http://schemas.microsoft.com/office/word/2016/wordml/cid" xmlns:w16="http://schemas.microsoft.com/office/word/2018/wordml" xmlns:w16du="http://schemas.microsoft.com/office/word/2023/wordml/word16du" xmlns:w16sdtdh="http://schemas.microsoft.com/office/word/2020/wordml/sdtdatahash" xmlns:w16sdtfl="http://schemas.microsoft.com/office/word/2024/wordml/sdtformatlock" xmlns:w16se="http://schemas.microsoft.com/office/word/2015/wordml/symex" xmlns:wpg="http://schemas.microsoft.com/office/word/2010/wordprocessingGroup" xmlns:wpi="http://schemas.microsoft.com/office/word/2010/wordprocessingInk" xmlns:wne="http://schemas.microsoft.com/office/word/2006/wordml" xmlns:wps="http://schemas.microsoft.com/office/word/2010/wordprocessingShape" mc:Ignorable="w14 w15 w16se w16cid w16 w16cex w16sdtdh w16sdtfl w16du wp14">
+  <w:p>
+    <w:pPr>
+      <w:pStyle w:val="Header"/>
+    </w:pPr>
+  </w:p>
+</w:hdr>
+</file>
+
+<file path=word/header3.xml><?xml version="1.0" encoding="utf-8"?>
+<w:hdr xmlns:wpc="http://schemas.microsoft.com/office/word/2010/wordprocessingCanvas" xmlns:cx="http://schemas.microsoft.com/office/drawing/2014/chartex" xmlns:cx1="http://schemas.microsoft.com/office/drawing/2015/9/8/chartex" xmlns:cx2="http://schemas.microsoft.com/office/drawing/2015/10/21/chartex" xmlns:cx3="http://schemas.microsoft.com/office/drawing/2016/5/9/chartex" xmlns:cx4="http://schemas.microsoft.com/office/drawing/2016/5/10/chartex" xmlns:cx5="http://schemas.microsoft.com/office/drawing/2016/5/11/chartex" xmlns:cx6="http://schemas.microsoft.com/office/drawing/2016/5/12/chartex" xmlns:cx7="http://schemas.microsoft.com/office/drawing/2016/5/13/chartex" xmlns:cx8="http://schemas.microsoft.com/office/drawing/2016/5/14/chartex" xmlns:mc="http://schemas.openxmlformats.org/markup-compatibility/2006" xmlns:aink="http://schemas.microsoft.com/office/drawing/2016/ink" xmlns:am3d="http://schemas.microsoft.com/office/drawing/2017/model3d" xmlns:o="urn:schemas-microsoft-com:office:office" xmlns:oel="http://schemas.microsoft.com/office/2019/extlst" xmlns:r="http://schemas.openxmlformats.org/officeDocument/2006/relationships" xmlns:m="http://schemas.openxmlformats.org/officeDocument/2006/math" xmlns:v="urn:schemas-microsoft-com:vml" xmlns:wp14="http://schemas.microsoft.com/office/word/2010/wordprocessingDrawing" xmlns:wp="http://schemas.openxmlformats.org/drawingml/2006/wordprocessingDrawing" xmlns:w10="urn:schemas-microsoft-com:office:word" xmlns:w="http://schemas.openxmlformats.org/wordprocessingml/2006/main" xmlns:w14="http://schemas.microsoft.com/office/word/2010/wordml" xmlns:w15="http://schemas.microsoft.com/office/word/2012/wordml" xmlns:w16cex="http://schemas.microsoft.com/office/word/2018/wordml/cex" xmlns:w16cid="http://schemas.microsoft.com/office/word/2016/wordml/cid" xmlns:w16="http://schemas.microsoft.com/office/word/2018/wordml" xmlns:w16du="http://schemas.microsoft.com/office/word/2023/wordml/word16du" xmlns:w16sdtdh="http://schemas.microsoft.com/office/word/2020/wordml/sdtdatahash" xmlns:w16sdtfl="http://schemas.microsoft.com/office/word/2024/wordml/sdtformatlock" xmlns:w16se="http://schemas.microsoft.com/office/word/2015/wordml/symex" xmlns:wpg="http://schemas.microsoft.com/office/word/2010/wordprocessingGroup" xmlns:wpi="http://schemas.microsoft.com/office/word/2010/wordprocessingInk" xmlns:wne="http://schemas.microsoft.com/office/word/2006/wordml" xmlns:wps="http://schemas.microsoft.com/office/word/2010/wordprocessingShape" mc:Ignorable="w14 w15 w16se w16cid w16 w16cex w16sdtdh w16sdtfl w16du wp14">
+  <w:p>
+    <w:pPr>
+      <w:pStyle w:val="Header"/>
+    </w:pPr>
+  </w:p>
+</w:hdr>
 </file>
 
 <file path=word/numbering.xml><?xml version="1.0" encoding="utf-8"?>

</xml_diff>

<commit_message>
Refine video walkthrough guidance
</commit_message>
<xml_diff>
--- a/Dynamic Vegetation Management - Documentation.docx
+++ b/Dynamic Vegetation Management - Documentation.docx
@@ -69,6 +69,7 @@
           <w:lang w:eastAsia="en-IN"/>
         </w:rPr>
       </w:pPr>
+      <w:proofErr w:type="spellStart"/>
       <w:r>
         <w:rPr>
           <w:rFonts w:ascii="Times New Roman" w:hAnsi="Times New Roman" w:cs="Times New Roman"/>
@@ -78,7 +79,19 @@
           <w:szCs w:val="32"/>
           <w:lang w:eastAsia="en-IN"/>
         </w:rPr>
-        <w:t>Khoushick S</w:t>
+        <w:t>Khoushick</w:t>
+      </w:r>
+      <w:proofErr w:type="spellEnd"/>
+      <w:r>
+        <w:rPr>
+          <w:rFonts w:ascii="Times New Roman" w:hAnsi="Times New Roman" w:cs="Times New Roman"/>
+          <w:b/>
+          <w:bCs/>
+          <w:sz w:val="32"/>
+          <w:szCs w:val="32"/>
+          <w:lang w:eastAsia="en-IN"/>
+        </w:rPr>
+        <w:t xml:space="preserve"> S</w:t>
       </w:r>
     </w:p>
     <w:p>
@@ -637,7 +650,15 @@
         <w:t>data-driven, predictive, and automated framework</w:t>
       </w:r>
       <w:r>
-        <w:t xml:space="preserve"> that ensures vegetation threats are detected, analyzed, and acted upon well before they become critical.</w:t>
+        <w:t xml:space="preserve"> that ensures vegetation threats are detected, </w:t>
+      </w:r>
+      <w:proofErr w:type="spellStart"/>
+      <w:r>
+        <w:t>analyzed</w:t>
+      </w:r>
+      <w:proofErr w:type="spellEnd"/>
+      <w:r>
+        <w:t>, and acted upon well before they become critical.</w:t>
       </w:r>
     </w:p>
     <w:p>
@@ -707,19 +728,20 @@
         </w:numPr>
       </w:pPr>
       <w:r>
-        <w:t>LiDAR generates high-density 3D point clouds for spatial geometry, while RGB images capture texture and color for species classification.</w:t>
+        <w:t xml:space="preserve">LiDAR generates high-density 3D point clouds for spatial geometry, while RGB images capture texture and </w:t>
+      </w:r>
+      <w:proofErr w:type="spellStart"/>
+      <w:r>
+        <w:t>color</w:t>
+      </w:r>
+      <w:proofErr w:type="spellEnd"/>
+      <w:r>
+        <w:t xml:space="preserve"> for species classification.</w:t>
       </w:r>
     </w:p>
     <w:p>
       <w:pPr>
         <w:pStyle w:val="NormalWeb"/>
-        <w:ind w:left="1440"/>
-      </w:pPr>
-    </w:p>
-    <w:p>
-      <w:pPr>
-        <w:pStyle w:val="NormalWeb"/>
-        <w:ind w:left="1440"/>
       </w:pPr>
     </w:p>
     <w:p>
@@ -920,8 +942,16 @@
         <w:rPr>
           <w:rStyle w:val="Strong"/>
         </w:rPr>
-        <w:t>Predictive Growth Modeling</w:t>
-      </w:r>
+        <w:t xml:space="preserve">Predictive Growth </w:t>
+      </w:r>
+      <w:proofErr w:type="spellStart"/>
+      <w:r>
+        <w:rPr>
+          <w:rStyle w:val="Strong"/>
+        </w:rPr>
+        <w:t>Modeling</w:t>
+      </w:r>
+      <w:proofErr w:type="spellEnd"/>
     </w:p>
     <w:p>
       <w:pPr>
@@ -1076,13 +1106,13 @@
           <w:noProof/>
         </w:rPr>
         <w:drawing>
-          <wp:anchor distT="0" distB="0" distL="114300" distR="114300" simplePos="0" relativeHeight="251660288" behindDoc="0" locked="0" layoutInCell="1" allowOverlap="1" wp14:anchorId="6C8504EC" wp14:editId="5BF2A956">
+          <wp:anchor distT="0" distB="0" distL="114300" distR="114300" simplePos="0" relativeHeight="251660288" behindDoc="0" locked="0" layoutInCell="1" allowOverlap="1" wp14:anchorId="6C8504EC" wp14:editId="39ADC9FC">
             <wp:simplePos x="0" y="0"/>
             <wp:positionH relativeFrom="margin">
               <wp:posOffset>3630930</wp:posOffset>
             </wp:positionH>
             <wp:positionV relativeFrom="margin">
-              <wp:posOffset>4507865</wp:posOffset>
+              <wp:posOffset>4827905</wp:posOffset>
             </wp:positionV>
             <wp:extent cx="2044065" cy="413385"/>
             <wp:effectExtent l="0" t="0" r="0" b="5715"/>
@@ -1150,13 +1180,13 @@
           <w:noProof/>
         </w:rPr>
         <w:drawing>
-          <wp:anchor distT="0" distB="0" distL="114300" distR="114300" simplePos="0" relativeHeight="251661312" behindDoc="0" locked="0" layoutInCell="1" allowOverlap="1" wp14:anchorId="09DB8537" wp14:editId="5F77F7B6">
+          <wp:anchor distT="0" distB="0" distL="114300" distR="114300" simplePos="0" relativeHeight="251661312" behindDoc="0" locked="0" layoutInCell="1" allowOverlap="1" wp14:anchorId="09DB8537" wp14:editId="1DAE1023">
             <wp:simplePos x="0" y="0"/>
             <wp:positionH relativeFrom="margin">
               <wp:posOffset>2160905</wp:posOffset>
             </wp:positionH>
             <wp:positionV relativeFrom="margin">
-              <wp:posOffset>4536440</wp:posOffset>
+              <wp:posOffset>4856480</wp:posOffset>
             </wp:positionV>
             <wp:extent cx="927100" cy="688975"/>
             <wp:effectExtent l="0" t="0" r="6350" b="0"/>
@@ -1224,13 +1254,13 @@
           <w:noProof/>
         </w:rPr>
         <w:drawing>
-          <wp:anchor distT="0" distB="0" distL="114300" distR="114300" simplePos="0" relativeHeight="251662336" behindDoc="0" locked="0" layoutInCell="1" allowOverlap="1" wp14:anchorId="1A454F10" wp14:editId="25B9AEE9">
+          <wp:anchor distT="0" distB="0" distL="114300" distR="114300" simplePos="0" relativeHeight="251662336" behindDoc="0" locked="0" layoutInCell="1" allowOverlap="1" wp14:anchorId="1A454F10" wp14:editId="7AF82B9D">
             <wp:simplePos x="0" y="0"/>
             <wp:positionH relativeFrom="margin">
               <wp:posOffset>5715000</wp:posOffset>
             </wp:positionH>
             <wp:positionV relativeFrom="margin">
-              <wp:posOffset>4495165</wp:posOffset>
+              <wp:posOffset>4815205</wp:posOffset>
             </wp:positionV>
             <wp:extent cx="974725" cy="744220"/>
             <wp:effectExtent l="0" t="0" r="0" b="0"/>
@@ -1298,13 +1328,13 @@
           <w:noProof/>
         </w:rPr>
         <w:drawing>
-          <wp:anchor distT="0" distB="0" distL="114300" distR="114300" simplePos="0" relativeHeight="251659264" behindDoc="0" locked="0" layoutInCell="1" allowOverlap="1" wp14:anchorId="6C68CD49" wp14:editId="2A83565C">
+          <wp:anchor distT="0" distB="0" distL="114300" distR="114300" simplePos="0" relativeHeight="251659264" behindDoc="0" locked="0" layoutInCell="1" allowOverlap="1" wp14:anchorId="6C68CD49" wp14:editId="0141F8EA">
             <wp:simplePos x="0" y="0"/>
             <wp:positionH relativeFrom="margin">
               <wp:posOffset>692150</wp:posOffset>
             </wp:positionH>
             <wp:positionV relativeFrom="margin">
-              <wp:posOffset>4534535</wp:posOffset>
+              <wp:posOffset>4854575</wp:posOffset>
             </wp:positionV>
             <wp:extent cx="1445895" cy="411480"/>
             <wp:effectExtent l="0" t="0" r="1905" b="7620"/>
@@ -1650,7 +1680,6 @@
         </w:numPr>
       </w:pPr>
       <w:r>
-        <w:lastRenderedPageBreak/>
         <w:t xml:space="preserve">Auto-generate </w:t>
       </w:r>
       <w:r>
@@ -1708,6 +1737,12 @@
     <w:p>
       <w:pPr>
         <w:pStyle w:val="NormalWeb"/>
+        <w:ind w:left="2160"/>
+      </w:pPr>
+    </w:p>
+    <w:p>
+      <w:pPr>
+        <w:pStyle w:val="NormalWeb"/>
         <w:numPr>
           <w:ilvl w:val="0"/>
           <w:numId w:val="15"/>
@@ -1717,6 +1752,7 @@
         <w:rPr>
           <w:rStyle w:val="Strong"/>
         </w:rPr>
+        <w:lastRenderedPageBreak/>
         <w:t>Feedback &amp; Continuous Learning</w:t>
       </w:r>
     </w:p>
@@ -1888,8 +1924,23 @@
           <w:lang w:eastAsia="en-IN"/>
           <w14:ligatures w14:val="none"/>
         </w:rPr>
-        <w:t>Predictive Growth Modeling</w:t>
-      </w:r>
+        <w:t xml:space="preserve">Predictive Growth </w:t>
+      </w:r>
+      <w:proofErr w:type="spellStart"/>
+      <w:r>
+        <w:rPr>
+          <w:rFonts w:ascii="Times New Roman" w:eastAsia="Times New Roman" w:hAnsi="Times New Roman" w:cs="Times New Roman"/>
+          <w:b/>
+          <w:bCs/>
+          <w:kern w:val="0"/>
+          <w:sz w:val="24"/>
+          <w:szCs w:val="24"/>
+          <w:lang w:eastAsia="en-IN"/>
+          <w14:ligatures w14:val="none"/>
+        </w:rPr>
+        <w:t>Modeling</w:t>
+      </w:r>
+      <w:proofErr w:type="spellEnd"/>
       <w:r>
         <w:rPr>
           <w:rFonts w:ascii="Times New Roman" w:eastAsia="Times New Roman" w:hAnsi="Times New Roman" w:cs="Times New Roman"/>
@@ -2544,6 +2595,7 @@
         </w:rPr>
         <w:t xml:space="preserve">Creates </w:t>
       </w:r>
+      <w:proofErr w:type="gramStart"/>
       <w:r>
         <w:rPr>
           <w:rFonts w:ascii="Times New Roman" w:eastAsia="Times New Roman" w:hAnsi="Times New Roman" w:cs="Times New Roman"/>
@@ -2555,7 +2607,21 @@
           <w:lang w:eastAsia="en-IN"/>
           <w14:ligatures w14:val="none"/>
         </w:rPr>
-        <w:t>Non-Outage events</w:t>
+        <w:t>Non-Outage</w:t>
+      </w:r>
+      <w:proofErr w:type="gramEnd"/>
+      <w:r>
+        <w:rPr>
+          <w:rFonts w:ascii="Times New Roman" w:eastAsia="Times New Roman" w:hAnsi="Times New Roman" w:cs="Times New Roman"/>
+          <w:b/>
+          <w:bCs/>
+          <w:kern w:val="0"/>
+          <w:sz w:val="24"/>
+          <w:szCs w:val="24"/>
+          <w:lang w:eastAsia="en-IN"/>
+          <w14:ligatures w14:val="none"/>
+        </w:rPr>
+        <w:t xml:space="preserve"> events</w:t>
       </w:r>
       <w:r>
         <w:rPr>
@@ -3004,8 +3070,23 @@
           <w:lang w:eastAsia="en-IN"/>
           <w14:ligatures w14:val="none"/>
         </w:rPr>
-        <w:t>TensorFlow / PyTorch</w:t>
-      </w:r>
+        <w:t xml:space="preserve">TensorFlow / </w:t>
+      </w:r>
+      <w:proofErr w:type="spellStart"/>
+      <w:r>
+        <w:rPr>
+          <w:rFonts w:ascii="Times New Roman" w:eastAsia="Times New Roman" w:hAnsi="Times New Roman" w:cs="Times New Roman"/>
+          <w:b/>
+          <w:bCs/>
+          <w:kern w:val="0"/>
+          <w:sz w:val="24"/>
+          <w:szCs w:val="24"/>
+          <w:lang w:eastAsia="en-IN"/>
+          <w14:ligatures w14:val="none"/>
+        </w:rPr>
+        <w:t>PyTorch</w:t>
+      </w:r>
+      <w:proofErr w:type="spellEnd"/>
       <w:r>
         <w:rPr>
           <w:rFonts w:ascii="Times New Roman" w:eastAsia="Times New Roman" w:hAnsi="Times New Roman" w:cs="Times New Roman"/>
@@ -3045,7 +3126,6 @@
           <w:lang w:eastAsia="en-IN"/>
           <w14:ligatures w14:val="none"/>
         </w:rPr>
-        <w:lastRenderedPageBreak/>
         <w:t>OpenCV</w:t>
       </w:r>
       <w:r>
@@ -3141,6 +3221,20 @@
         </w:rPr>
         <w:t xml:space="preserve"> – Efficient crew routing based on stored growth data.</w:t>
       </w:r>
+    </w:p>
+    <w:p>
+      <w:pPr>
+        <w:spacing w:before="100" w:beforeAutospacing="1" w:after="100" w:afterAutospacing="1" w:line="240" w:lineRule="auto"/>
+        <w:ind w:left="720"/>
+        <w:rPr>
+          <w:rFonts w:ascii="Times New Roman" w:eastAsia="Times New Roman" w:hAnsi="Times New Roman" w:cs="Times New Roman"/>
+          <w:kern w:val="0"/>
+          <w:sz w:val="24"/>
+          <w:szCs w:val="24"/>
+          <w:lang w:eastAsia="en-IN"/>
+          <w14:ligatures w14:val="none"/>
+        </w:rPr>
+      </w:pPr>
     </w:p>
     <w:p>
       <w:pPr>

</xml_diff>